<commit_message>
docs: update management overview for September status
</commit_message>
<xml_diff>
--- a/docs/management/Future-Factory-ontwikkeling-idee-naar-fabriekssysteem.docx
+++ b/docs/management/Future-Factory-ontwikkeling-idee-naar-fabriekssysteem.docx
@@ -12,7 +12,7 @@
     </w:p>
     <w:p>
       <w:r>
-        <w:t>Managementoverzicht | november 2025 t/m 7 september 2026</w:t>
+        <w:t>Managementoverzicht | november 2025 t/m september 2026</w:t>
       </w:r>
     </w:p>
     <w:p>
@@ -641,7 +641,7 @@
               <w:rPr>
                 <w:sz w:val="19"/>
               </w:rPr>
-              <w:t>1–7 september 2026</w:t>
+              <w:t>September 2026</w:t>
               <w:br/>
               <w:t>Stabiliseren en voorbereiden</w:t>
             </w:r>
@@ -784,7 +784,7 @@
         <w:rPr>
           <w:sz w:val="19"/>
         </w:rPr>
-        <w:t>De onderstaande verdeling maakt de orde van grootte per domein zichtbaar voor 30 maart–7 september. Het zijn afgeronde indicaties uit de eerdere reconstructie, geen apart geregistreerde uren. De voorbereiding vóór de pilot valt buiten deze grafiek; de domeinen vormen een andere kijk op hetzelfde werk en komen niet boven op de tijdlijn.</w:t>
+        <w:t>De onderstaande verdeling maakt de orde van grootte per domein zichtbaar voor 30 maart–september. Het zijn afgeronde indicaties uit de eerdere reconstructie, geen apart geregistreerde uren. De voorbereiding vóór de pilot valt buiten deze grafiek; de domeinen vormen een andere kijk op hetzelfde werk en komen niet boven op de tijdlijn.</w:t>
       </w:r>
     </w:p>
     <w:p>
@@ -833,7 +833,7 @@
         <w:pStyle w:val="Heading1"/>
       </w:pPr>
       <w:r>
-        <w:t>Stand van zaken op 7 september 2026</w:t>
+        <w:t>Stand van zaken in september 2026</w:t>
       </w:r>
     </w:p>
     <w:p>
@@ -843,7 +843,7 @@
     </w:p>
     <w:p>
       <w:r>
-        <w:t>P14 betreft de verdere inrichting van de bedrijfsomgeving. Een belangrijk onderdeel is IAM: het beheer van wie toegang heeft en wat iemand mag doen. Denk aan operators, teamleaders, planners en beheerders, maar ook aan machineaccounts, afdelingen en bevoegdheden. De overgang naar deze rechtenstructuur moet gecontroleerd plaatsvinden.</w:t>
+        <w:t>P14 is taak 14, ook wel het voortgangsproject 14 binnen Future Factory. Deze taak gaat over de verdere inrichting van de bedrijfsomgeving. Een belangrijk onderdeel is IAM: het beheer van wie toegang heeft en wat iemand mag doen. Denk aan operators, teamleaders, planners en beheerders, maar ook aan machineaccounts, afdelingen en bevoegdheden. De overgang naar deze rechtenstructuur moet gecontroleerd plaatsvinden en hoort bij de bedrijfsbrede inrichting van Future Factory.</w:t>
       </w:r>
     </w:p>
     <w:p>
@@ -980,14 +980,8 @@
             </w:tcMar>
           </w:tcPr>
           <w:p>
-            <w:pPr>
-              <w:spacing w:after="40" w:line="240" w:lineRule="auto"/>
-            </w:pPr>
             <w:r>
-              <w:rPr>
-                <w:sz w:val="19"/>
-              </w:rPr>
-              <w:t>BH12 → Lossen 12/18 → waar nodig Mazak → volgende bewerking. Test de hele keten, inclusief uitzonderingen en herstel na fouten.</w:t>
+              <w:t>BH12 → Lossen 12/18 → waar nodig Mazak/nabewerken → volgende bewerking. Test de hele keten, inclusief uitzonderingen en herstel na fouten.</w:t>
             </w:r>
           </w:p>
         </w:tc>
@@ -1033,14 +1027,8 @@
             </w:tcMar>
           </w:tcPr>
           <w:p>
-            <w:pPr>
-              <w:spacing w:after="40" w:line="240" w:lineRule="auto"/>
-            </w:pPr>
             <w:r>
-              <w:rPr>
-                <w:sz w:val="19"/>
-              </w:rPr>
-              <w:t>Mazak-routering corrigeren, printerresolutie en automatisch snijden controleren. Labelaanpassing voor 25090 afstemmen met de teamleader.</w:t>
+              <w:t>Mazak-routering corrigeren, printerresolutie en automatisch snijden controleren.</w:t>
             </w:r>
           </w:p>
         </w:tc>
@@ -1162,7 +1150,13 @@
     </w:p>
     <w:p>
       <w:r>
-        <w:t>Maak structureel tijd vrij voor ontwikkeling én praktijktesten met operators, planning en kwaliteit. Spreek af wie eigenaar is van het systeem, wie ondersteuning levert en wanneer een nieuwe productiestroom voldoende is getest om in gebruik te nemen. Ongeveer 90% ontwikkeling in vrije tijd verklaart de inzet tot nu toe, maar biedt geen vaste basis voor bedrijfsbreed beheer.</w:t>
+        <w:t>Maak structureel tijd vrij voor ontwikkeling, praktijktesten en begeleiding op de werkvloer. Er is serieus meer tijd nodig om medewerkers te trainen, maar vooral om hen mee te krijgen in de nieuwe werkwijze. De feedback van de mensen die al met Future Factory werken is daarbij essentieel. De twee ploegen bij BH18 werken inmiddels zo vertrouwd met het systeem dat de papieren versie die er nog naast bestaat juist onrust veroorzaakt. Planning moet daarom weten dat orders niet meer op de oude manier met papiertjes tussen stappen kunnen worden geschoven. Medewerkers die nog aansluiten moeten ervaren dat dit breed door Future Pipe BV wordt gedragen en niet als iets persoonlijks of opgedrongens wordt ingevoerd. Spreek daarnaast af wie eigenaar is van het systeem, wie ondersteuning levert en wanneer een nieuwe productiestroom voldoende is getest om in gebruik te nemen. De ongeveer 90% ontwikkeling in vrije tijd verklaart de inzet tot nu toe, maar biedt geen vaste basis voor bedrijfsbreed beheer. De lage kosten die nu privé zijn betaald, moeten daarom ook worden overgebracht naar Future Pipe BV.</w:t>
+      </w:r>
+    </w:p>
+    <w:p>
+      <w:pPr/>
+      <w:r>
+        <w:t>Een praktisch voorbeeld is de route na BH18: zodra een product is gelost en naar nabewerken gaat, hoort de medewerker bij nabewerken het product met de scanner gereed te melden. Als dat wordt overgeslagen omdat er zogenaamd geen tijd voor is, krijgt Eindinspectie extra werk: daar moet het product opnieuw gereed worden gemeld en nogmaals worden gescand. De digitale werkwijze werkt alleen als iedere stap op de juiste plek wordt uitgevoerd.</w:t>
       </w:r>
     </w:p>
     <w:p>
@@ -1196,6 +1190,7 @@
     </w:p>
     <w:sectPr>
       <w:footerReference w:type="default" r:id="rId10"/>
+      <w:headerReference w:type="default" r:id="rId11"/>
       <w:pgSz w:w="11906" w:h="16838"/>
       <w:pgMar w:top="964" w:right="1077" w:bottom="907" w:left="1077" w:header="720" w:footer="720" w:gutter="0"/>
       <w:cols w:space="720"/>
@@ -1216,11 +1211,21 @@
       <w:rPr>
         <w:sz w:val="16"/>
       </w:rPr>
-      <w:t xml:space="preserve">Future Factory | 7 september 2026 | </w:t>
+      <w:t xml:space="preserve">Future Factory | september 2026 | </w:t>
     </w:r>
     <w:fldSimple w:instr="PAGE"/>
   </w:p>
 </w:ftr>
+</file>
+
+<file path=word/header1.xml><?xml version="1.0" encoding="utf-8"?>
+<w:hdr xmlns:m="http://schemas.openxmlformats.org/officeDocument/2006/math" xmlns:mc="http://schemas.openxmlformats.org/markup-compatibility/2006" xmlns:mo="http://schemas.microsoft.com/office/mac/office/2008/main" xmlns:mv="urn:schemas-microsoft-com:mac:vml" xmlns:o="urn:schemas-microsoft-com:office:office" xmlns:r="http://schemas.openxmlformats.org/officeDocument/2006/relationships" xmlns:v="urn:schemas-microsoft-com:vml" xmlns:w10="urn:schemas-microsoft-com:office:word" xmlns:w14="http://schemas.microsoft.com/office/word/2010/wordml" xmlns:w="http://schemas.openxmlformats.org/wordprocessingml/2006/main" xmlns:wne="http://schemas.microsoft.com/office/word/2006/wordml" xmlns:wp14="http://schemas.microsoft.com/office/word/2010/wordprocessingDrawing" xmlns:wp="http://schemas.openxmlformats.org/drawingml/2006/wordprocessingDrawing" xmlns:wpc="http://schemas.microsoft.com/office/word/2010/wordprocessingCanvas" xmlns:wpg="http://schemas.microsoft.com/office/word/2010/wordprocessingGroup" xmlns:wpi="http://schemas.microsoft.com/office/word/2010/wordprocessingInk" xmlns:wps="http://schemas.microsoft.com/office/word/2010/wordprocessingShape" mc:Ignorable="w14 wp14">
+  <w:p>
+    <w:pPr>
+      <w:pStyle w:val="Header"/>
+    </w:pPr>
+  </w:p>
+</w:hdr>
 </file>
 
 <file path=word/numbering.xml><?xml version="1.0" encoding="utf-8"?>

</xml_diff>

<commit_message>
docs: simplify management overview language
</commit_message>
<xml_diff>
--- a/docs/management/Future-Factory-ontwikkeling-idee-naar-fabriekssysteem.docx
+++ b/docs/management/Future-Factory-ontwikkeling-idee-naar-fabriekssysteem.docx
@@ -25,12 +25,12 @@
     </w:p>
     <w:p>
       <w:r>
-        <w:t>Future Factory is gegroeid van een idee voor digitale ondersteuning op de werkvloer naar de basis van een fabriekssysteem dat productie, planning, kwaliteit en productinformatie met elkaar verbindt. BH18 wordt in de praktijk ondersteund en BH16 is toegevoegd. De volgende stap is de voorbereide keten BH12/Mazak gecontroleerd in gebruik nemen en het systeem duurzaam beheren.</w:t>
+        <w:t>Future Factory begon als een idee om het werk op de werkvloer digitaal te ondersteunen. Inmiddels is het uitgegroeid tot een systeem waarin productie, planning, kwaliteit en productinformatie samenkomen. BH18 werkt ermee in de praktijk en BH16 is toegevoegd. De volgende stap is om de keten van BH12 en Mazak gecontroleerd in gebruik te nemen en daarna goed te blijven beheren.</w:t>
       </w:r>
     </w:p>
     <w:p>
       <w:r>
-        <w:t>Het idee en de eerste uitwerking begonnen in november 2025. Tot en met maart 2026 lag het accent op concept, technische opzet en voorbereiding. Op 30 maart 2026 startte de echte pilot op BH18. Volgens de ontwikkelaar is ongeveer 90% van de ontwikkeling in vrije tijd gedaan.</w:t>
+        <w:t>Het idee en de eerste uitwerking begonnen in november 2025. Tot en met maart 2026 ging het vooral om het uitdenken van het concept, de technische basis en de voorbereiding. Op 30 maart 2026 begon de echte pilot op BH18. Ongeveer 90% van de ontwikkeling is in vrije tijd gedaan.</w:t>
       </w:r>
     </w:p>
     <w:p>
@@ -186,14 +186,8 @@
             </w:tcMar>
           </w:tcPr>
           <w:p>
-            <w:pPr>
-              <w:spacing w:after="40" w:line="240" w:lineRule="auto"/>
-            </w:pPr>
             <w:r>
-              <w:rPr>
-                <w:sz w:val="19"/>
-              </w:rPr>
-              <w:t>Werkproces uitdenken, concept uitwerken en de technische basis voorbereiden. Nog geen echte BH18-pilot.</w:t>
+              <w:t>De eerste digitale werkplek op BH18: orders bekijken, productie starten en gereedmelden, lotnummers en eerste labels.</w:t>
             </w:r>
           </w:p>
         </w:tc>
@@ -265,14 +259,8 @@
             </w:tcMar>
           </w:tcPr>
           <w:p>
-            <w:pPr>
-              <w:spacing w:after="40" w:line="240" w:lineRule="auto"/>
-            </w:pPr>
             <w:r>
-              <w:rPr>
-                <w:sz w:val="19"/>
-              </w:rPr>
-              <w:t>Digitale machinewerkplek: orders bekijken, productie starten en gereedmelden, lotnummers en eerste labels.</w:t>
+              <w:t>De eerste digitale werkplek op BH18: orders bekijken, productie starten en gereedmelden, lotnummers en eerste labels.</w:t>
             </w:r>
           </w:p>
         </w:tc>
@@ -344,14 +332,8 @@
             </w:tcMar>
           </w:tcPr>
           <w:p>
-            <w:pPr>
-              <w:spacing w:after="40" w:line="240" w:lineRule="auto"/>
-            </w:pPr>
             <w:r>
-              <w:rPr>
-                <w:sz w:val="19"/>
-              </w:rPr>
-              <w:t>Planning en productstatussen verbinden; inzicht in waar producten zijn, wat gereed is en wat nog moet.</w:t>
+              <w:t>Planning en productstatussen verbinden, zodat zichtbaar is waar producten zijn en welke stap nog volgt.</w:t>
             </w:r>
           </w:p>
         </w:tc>
@@ -423,14 +405,8 @@
             </w:tcMar>
           </w:tcPr>
           <w:p>
-            <w:pPr>
-              <w:spacing w:after="40" w:line="240" w:lineRule="auto"/>
-            </w:pPr>
             <w:r>
-              <w:rPr>
-                <w:sz w:val="19"/>
-              </w:rPr>
-              <w:t>Kwaliteitscontrole, producthistorie, teamleaderoverzichten, labels en printwachtrijen; cloud en koppelingen uitbreiden.</w:t>
+              <w:t>Kwaliteitscontrole, producthistorie, teamleaderoverzichten, labels, printwachtrijen en cloudfuncties uitbreiden.</w:t>
             </w:r>
           </w:p>
         </w:tc>
@@ -502,14 +478,8 @@
             </w:tcMar>
           </w:tcPr>
           <w:p>
-            <w:pPr>
-              <w:spacing w:after="40" w:line="240" w:lineRule="auto"/>
-            </w:pPr>
             <w:r>
-              <w:rPr>
-                <w:sz w:val="19"/>
-              </w:rPr>
-              <w:t>Software beter organiseren, automatische controles toevoegen, beveiliging en prestaties verbeteren en fouten oplossen.</w:t>
+              <w:t>Testen, beveiliging, prestaties en foutmeldingen verbeteren en de software overzichtelijker maken.</w:t>
             </w:r>
           </w:p>
         </w:tc>
@@ -581,14 +551,8 @@
             </w:tcMar>
           </w:tcPr>
           <w:p>
-            <w:pPr>
-              <w:spacing w:after="40" w:line="240" w:lineRule="auto"/>
-            </w:pPr>
             <w:r>
-              <w:rPr>
-                <w:sz w:val="19"/>
-              </w:rPr>
-              <w:t>BH16 toevoegen en stabiliseren; printers verbeteren en werken aan gebruikersrechten en schaalbaarheid.</w:t>
+              <w:t>BH16 toevoegen en stabiel maken, printers verbeteren en de basis voor gebruikersrechten leggen.</w:t>
             </w:r>
           </w:p>
         </w:tc>
@@ -725,27 +689,27 @@
         <w:pStyle w:val="Heading1"/>
       </w:pPr>
       <w:r>
-        <w:t>Wat er achter de schermen is opgebouwd</w:t>
+        <w:t>1 Wat er achter de schermen is opgebouwd</w:t>
       </w:r>
     </w:p>
     <w:p>
       <w:r>
-        <w:t>De BH18-pilot begon met een praktische vraag: kan een operator op een tablet zien wat hij moet maken, de productie registreren en het juiste label printen? Tijdens het gebruik kwamen nieuwe vragen naar voren: waar ligt een product, welke bewerking volgt, welk lotnummer hoort erbij en hoe wordt afkeur verwerkt? Daardoor moesten steeds meer onderdelen samenwerken.</w:t>
+        <w:t>De pilot op BH18 begon met een eenvoudige vraag: kan een operator op een tablet zien wat hij moet maken, de productie registreren en het juiste label printen? In de praktijk kwamen daarna meer vragen. Waar is het product? Welke stap volgt? Welk lotnummer hoort erbij? Wat gebeurt er bij afkeur? Om die vragen goed te beantwoorden moesten steeds meer onderdelen met elkaar samenwerken.</w:t>
       </w:r>
     </w:p>
     <w:p>
       <w:r>
-        <w:t>Planning en producttracking maken werk en voortgang zichtbaar. Kwaliteitscontrole (QC), lotnummers en producthistorie helpen terugvinden wat met een product is gebeurd. Labels, scanners en printers verbinden de digitale registratie met het fysieke product. Teamleaders krijgen overzichten; rapportages en exports maken informatie bruikbaar buiten het machinescherm.</w:t>
+        <w:t>Planning en productvolging maken zichtbaar wat er moet gebeuren en hoe ver het werk is. Kwaliteitscontrole, lotnummers en de producthistorie laten zien wat er met een product is gebeurd. Labels, scanners en printers verbinden de digitale registratie met het echte product. Teamleaders krijgen overzichten en rapportages maken de informatie ook buiten het machinescherm bruikbaar.</w:t>
       </w:r>
     </w:p>
     <w:p>
       <w:r>
-        <w:t>De cloudomgeving in Firebase bewaart gegevens centraal. De backend verwerkt acties achter de schermen en zorgt dat schermen dezelfde informatie gebruiken. Ook is gewerkt aan beheer, AI-functionaliteit en voorbereiding op koppelingen met Infor LN/ION. Voorbereiding op een koppeling betekent nog niet dat die volledig in productie werkt.</w:t>
+        <w:t>De gegevens worden centraal opgeslagen in de cloudomgeving. De backend is het deel achter de schermen dat acties verwerkt en ervoor zorgt dat verschillende schermen dezelfde informatie gebruiken. Ook is gewerkt aan beheer, AI-functies en de voorbereiding op koppelingen met Infor LN/ION. Een voorbereiding op een koppeling betekent nog niet dat die koppeling al volledig in productie werkt.</w:t>
       </w:r>
     </w:p>
     <w:p>
       <w:r>
-        <w:t>Met de groei werd professionalisering noodzakelijk: automatische tests, betere foutmeldingen, beveiliging, registratie van storingen, stabielere printerverbindingen en minder onnodig databaseverkeer. Dit werk levert vaak geen nieuwe knop op, maar is nodig om bestaande functies betrouwbaar te laten samenwerken.</w:t>
+        <w:t>Toen het systeem groter werd, was extra onderhoud nodig. Er kwamen automatische tests, duidelijkere foutmeldingen, betere beveiliging, registratie van storingen en stabielere printerverbindingen. Ook is onnodig databaseverkeer verminderd. Dit werk levert meestal geen nieuwe knop op, maar zorgt ervoor dat bestaande functies betrouwbaar blijven samenwerken.</w:t>
       </w:r>
     </w:p>
     <w:p>
@@ -753,22 +717,22 @@
         <w:pStyle w:val="Heading1"/>
       </w:pPr>
       <w:r>
-        <w:t>Waarom één knop veel werk vraagt</w:t>
+        <w:t>2 Waarom één knop veel werk vraagt</w:t>
       </w:r>
     </w:p>
     <w:p>
       <w:r>
-        <w:t>Een knop als “Gereed” moet meer doen dan een scherm veranderen. Het systeem moet de medewerker en zijn rechten controleren, de juiste order en het juiste lotnummer bijwerken, de vervolgroute bepalen, planning aanpassen, een label klaarzetten en de handeling bewaren in de historie.</w:t>
+        <w:t>Een knop als “Gereed” lijkt eenvoudig, maar achter die knop gebeurt veel. Het systeem controleert wie de medewerker is en wat die mag doen. Daarna worden de juiste order en het lotnummer bijgewerkt, wordt de volgende stap bepaald, wordt de planning aangepast, wordt een label klaargezet en wordt de handeling opgeslagen in de historie.</w:t>
       </w:r>
     </w:p>
     <w:p>
       <w:r>
-        <w:t>Daarnaast moet het goed blijven gaan bij dubbel klikken, een wegvallende internetverbinding of een printerstoring. Een wijziging moet vervolgens worden getest op meerdere schermen en machines, zodat een oplossing voor Mazak geen probleem veroorzaakt bij BH18 of BH16.</w:t>
+        <w:t>Ook moet het systeem goed reageren als iemand twee keer klikt, de internetverbinding wegvalt of een printer niet reageert. Elke wijziging moet daarom op meerdere schermen en machines worden getest. Een oplossing voor Mazak mag geen nieuw probleem veroorzaken bij BH18 of BH16.</w:t>
       </w:r>
     </w:p>
     <w:p>
       <w:r>
-        <w:t>Een concreet voorbeeld is de route bij BH12: na “klaar wikkelen” moet het product eerst naar Lossen 12/18. Pas na het lossen volgt, waar van toepassing, Mazak. De zichtbare correctie lijkt klein, maar raakt productstatus, planning, werkvoorraad en labels.</w:t>
+        <w:t>Een concreet voorbeeld is de route bij BH12. Na “klaar wikkelen” moet het product eerst naar Lossen 12/18. Pas daarna gaat het, waar nodig, naar Mazak of nabewerken. Dat lijkt een kleine routewijziging, maar raakt tegelijk de productstatus, de planning, de werkvoorraad en de labels.</w:t>
       </w:r>
     </w:p>
     <w:p>
@@ -776,15 +740,12 @@
         <w:pStyle w:val="Heading1"/>
       </w:pPr>
       <w:r>
-        <w:t>Waar de ontwikkeltijd in zit</w:t>
+        <w:t>3 Waar de ontwikkeltijd in zit</w:t>
       </w:r>
     </w:p>
     <w:p>
       <w:r>
-        <w:rPr>
-          <w:sz w:val="19"/>
-        </w:rPr>
-        <w:t>De onderstaande verdeling maakt de orde van grootte per domein zichtbaar voor 30 maart–september. Het zijn afgeronde indicaties uit de eerdere reconstructie, geen apart geregistreerde uren. De voorbereiding vóór de pilot valt buiten deze grafiek; de domeinen vormen een andere kijk op hetzelfde werk en komen niet boven op de tijdlijn.</w:t>
+        <w:t>De uren hieronder zijn per fase weergegeven, zodat zichtbaar blijft welk soort werk is gedaan. Het zijn schattingen op basis van ontwikkelsessies en de changelog, geen afzonderlijk bijgehouden uren. De voorbereiding vóór de pilot staat apart in de tijdlijn. De domeinen hieronder zijn een andere manier om hetzelfde werk te bekijken en moeten niet bij de tijdlijn worden opgeteld.</w:t>
       </w:r>
     </w:p>
     <w:p>
@@ -833,22 +794,22 @@
         <w:pStyle w:val="Heading1"/>
       </w:pPr>
       <w:r>
-        <w:t>Stand van zaken in september 2026</w:t>
+        <w:t>4 Stand van zaken in september 2026</w:t>
       </w:r>
     </w:p>
     <w:p>
       <w:r>
-        <w:t>BH18 draait met Future Factory. BH16 is als tweede machine toegevoegd en wordt verder gestabiliseerd. Daarmee is ervaring opgedaan met gebruik op meerdere machines, elk met eigen werkprocessen en uitzonderingen.</w:t>
+        <w:t>BH18 werkt met Future Factory. BH16 is als tweede machine toegevoegd en wordt verder stabiel gemaakt. Daardoor is ervaring opgedaan met meerdere machines, elk met een eigen werkwijze en eigen uitzonderingen.</w:t>
       </w:r>
     </w:p>
     <w:p>
       <w:r>
-        <w:t>P14 is taak 14, ook wel het voortgangsproject 14 binnen Future Factory. Deze taak gaat over de verdere inrichting van de bedrijfsomgeving. Een belangrijk onderdeel is IAM: het beheer van wie toegang heeft en wat iemand mag doen. Denk aan operators, teamleaders, planners en beheerders, maar ook aan machineaccounts, afdelingen en bevoegdheden. De overgang naar deze rechtenstructuur moet gecontroleerd plaatsvinden en hoort bij de bedrijfsbrede inrichting van Future Factory. Voor een begrijpelijke uitleg van IAM, rollen, rechten en certificeringen verwijst dit document naar het tweede IAM-document: “Future Factory – Vervolgdocument 2 – IAM met EDF”.</w:t>
+        <w:t>P14 is taak 14, ook wel voortgangsproject 14 binnen Future Factory. Deze taak gaat over de verdere inrichting van de bedrijfsomgeving. Een belangrijk onderdeel is IAM: bepalen wie toegang heeft en welke handelingen iemand mag uitvoeren. Dat geldt voor operators, teamleaders, planners, beheerders en machineaccounts. De overgang naar deze rechtenstructuur moet stap voor stap worden getest. Voor een uitleg met voorbeelden van rollen, rechten en certificeringen verwijst dit document naar het tweede IAM-document: “Future Factory – Vervolgdocument 2 – IAM met EDF”.</w:t>
       </w:r>
     </w:p>
     <w:p>
       <w:r>
-        <w:t>BH12 en Mazak zijn volgens de projectinschatting circa 90% softwarematig gereed. Schermen, productgegevens, acties, labels, printwachtrijen en routing zijn grotendeels voorbereid. Dat percentage beschrijft de softwarevoorbereiding; het zegt niet dat de complete productiestroom al voor 90% in de praktijk is gevalideerd.</w:t>
+        <w:t>BH12 en Mazak zijn volgens de projectinschatting ongeveer 90% softwarematig gereed. De schermen, productgegevens, acties, labels, printwachtrijen en routes zijn grotendeels voorbereid. Dit percentage gaat alleen over de software. Het betekent niet dat de volledige productiestroom al voor 90% op de werkvloer is getest.</w:t>
       </w:r>
     </w:p>
     <w:p>
@@ -856,12 +817,12 @@
         <w:pStyle w:val="Heading1"/>
       </w:pPr>
       <w:r>
-        <w:t>De volgende fase is productioniseren</w:t>
+        <w:t>5 De volgende fase is productioniseren</w:t>
       </w:r>
     </w:p>
     <w:p>
       <w:r>
-        <w:t>Productioniseren betekent: de gebouwde software geschikt maken voor dagelijks, betrouwbaar gebruik op de werkvloer. Voor de drukkere keten BH12/Mazak vraagt dit om testen met echte orders, werkende apparatuur, duidelijke afspraken en een gecontroleerde ingebruikname.</w:t>
+        <w:t>Productioniseren betekent dat de gebouwde software geschikt wordt gemaakt voor dagelijks gebruik. Voor de keten BH12/Mazak betekent dit testen met echte orders, werkende apparatuur, duidelijke afspraken en een gecontroleerde start. Ook moet duidelijk zijn wie helpt als er iets misgaat.</w:t>
       </w:r>
     </w:p>
     <w:tbl>
@@ -1145,7 +1106,7 @@
         <w:pStyle w:val="Heading1"/>
       </w:pPr>
       <w:r>
-        <w:t>Wat dit van management vraagt</w:t>
+        <w:t>6 Wat dit van management vraagt</w:t>
       </w:r>
     </w:p>
     <w:p>
@@ -1169,23 +1130,17 @@
         <w:pStyle w:val="Heading1"/>
       </w:pPr>
       <w:r>
-        <w:t>Bronnen en duiding van de uren</w:t>
+        <w:t>7 Bronnen en uitleg van de uren</w:t>
       </w:r>
     </w:p>
     <w:p>
       <w:r>
-        <w:rPr>
-          <w:sz w:val="18"/>
-        </w:rPr>
-        <w:t>Basis: docs/CONVERSATION_SUMMARY.md uit het aangeleverde projectarchief, de conversatie “Programma analyse” en de correcties van de ontwikkelaar. De geraadpleegde changelog bevat gedateerde ontwikkelnotities tot eind augustus; de actuele septemberstatus komt uit de conversatie.</w:t>
+        <w:t>Dit overzicht is gebaseerd op docs/CONVERSATION_SUMMARY.md, de conversatie “Programma analyse” en de toelichting van de ontwikkelaar. De changelog bevat ontwikkelnotities tot eind augustus. De stand van zaken in september komt uit de recente projectbespreking.</w:t>
       </w:r>
     </w:p>
     <w:p>
       <w:r>
-        <w:rPr>
-          <w:sz w:val="18"/>
-        </w:rPr>
-        <w:t>De maandbandbreedtes en domeinverdeling zijn overgenomen uit de eerdere reconstructie, met september aangepast naar circa 40 uur. Voor november–maart is een voorlopige bandbreedte toegevoegd. Ontwerp, uitzoeken, programmeren, testen en herstelwerk vallen allemaal onder de geschatte inspanning. De uren zijn geen bewijs van geschreven tijd, facturabele uren of gerealiseerde besparingen.</w:t>
+        <w:t>De uren zijn een reconstructie en schatting. Ze zijn gebaseerd op ontwikkelsessies en de changelog en zijn geen officiële urenregistratie. Ontwerpen, uitzoeken, programmeren, testen en herstelwerk zijn allemaal meegerekend. De uren zijn ook geen bewijs van facturabele uren of gerealiseerde besparingen.</w:t>
       </w:r>
     </w:p>
     <w:sectPr>

</xml_diff>

<commit_message>
docs: soften management guidance language
</commit_message>
<xml_diff>
--- a/docs/management/Future-Factory-ontwikkeling-idee-naar-fabriekssysteem.docx
+++ b/docs/management/Future-Factory-ontwikkeling-idee-naar-fabriekssysteem.docx
@@ -1111,18 +1111,18 @@
     </w:p>
     <w:p>
       <w:r>
-        <w:t>Maak structureel tijd vrij voor ontwikkeling, praktijktesten en begeleiding op de werkvloer. Er is serieus meer tijd nodig om medewerkers te trainen, maar vooral om hen mee te krijgen in de nieuwe werkwijze. De feedback van de mensen die al met Future Factory werken is daarbij essentieel. De twee ploegen bij BH18 werken inmiddels zo vertrouwd met het systeem dat de papieren versie die er nog naast bestaat juist onrust veroorzaakt. Planning moet daarom weten dat orders niet meer op de oude manier met papiertjes tussen stappen kunnen worden geschoven. Medewerkers die nog aansluiten moeten ervaren dat dit breed door Future Pipe BV wordt gedragen en niet als iets persoonlijks of opgedrongens wordt ingevoerd. Spreek daarnaast af wie eigenaar is van het systeem, wie ondersteuning levert en wanneer een nieuwe productiestroom voldoende is getest om in gebruik te nemen. De ongeveer 90% ontwikkeling in vrije tijd verklaart de inzet tot nu toe, maar biedt geen vaste basis voor bedrijfsbreed beheer. De lage kosten die nu privé zijn betaald, moeten daarom ook worden overgebracht naar Future Pipe BV.</w:t>
+        <w:t>Voor een goede invoering helpt het om structureel tijd beschikbaar te maken voor ontwikkeling, praktijktesten en begeleiding op de werkvloer. Er is tijd nodig om medewerkers te trainen en vooral om hen rustig mee te nemen in de nieuwe werkwijze. De feedback van mensen die al met Future Factory werken blijft daarbij belangrijk. De twee ploegen bij BH18 werken inmiddels zo vertrouwd met het systeem dat de papieren versie die er nog naast bestaat juist onrust kan veroorzaken. Het is daarom wenselijk dat planning weet dat orders niet meer op de oude manier met papiertjes tussen stappen worden geschoven. Medewerkers die nog aansluiten, moeten kunnen ervaren dat Future Factory breed door Future Pipe BV wordt gedragen en niet als iets persoonlijks of opgedrongens wordt ingevoerd. Het helpt ook om vooraf vast te leggen wie eigenaar is van het systeem, wie ondersteuning levert en wanneer een nieuwe productiestroom voldoende is getest om in gebruik te nemen. De ongeveer 90% ontwikkeling in vrije tijd verklaart de inzet tot nu toe, maar vormt geen vaste basis voor bedrijfsbreed beheer. De lage kosten die nu privé zijn betaald, zouden daarom geleidelijk naar Future Pipe BV kunnen worden overgebracht.</w:t>
       </w:r>
     </w:p>
     <w:p>
       <w:pPr/>
       <w:r>
-        <w:t>Een praktisch voorbeeld is de route na BH18: zodra een product is gelost en naar nabewerken gaat, hoort de medewerker bij nabewerken het product met de scanner gereed te melden. Als dat wordt overgeslagen omdat er zogenaamd geen tijd voor is, krijgt Eindinspectie extra werk: daar moet het product opnieuw gereed worden gemeld en nogmaals worden gescand. De digitale werkwijze werkt alleen als iedere stap op de juiste plek wordt uitgevoerd.</w:t>
+        <w:t>Een praktisch voorbeeld is de route na BH18: zodra een product is gelost en naar nabewerken gaat, is het de bedoeling dat de medewerker bij nabewerken het product met de scanner gereed meldt. Als dat wordt overgeslagen omdat er geen tijd voor lijkt te zijn, krijgt Eindinspectie extra werk: daar moet het product opnieuw gereed worden gemeld en nogmaals worden gescand. De digitale werkwijze werkt dus het best als iedere stap op de juiste plek wordt uitgevoerd.</w:t>
       </w:r>
     </w:p>
     <w:p>
       <w:r>
-        <w:t>Na een bewezen BH12/Mazak-keten kunnen verdere uitbreidingen worden beoordeeld, zoals BH11/BH31 op basis van BH16 en BH15 op basis van BH12. De eerstvolgende mijlpaal is een betrouwbaar werkende keten, met geteste labels, juiste productroutes en duidelijke gebruikersrechten.</w:t>
+        <w:t>Na een bewezen BH12/Mazak-keten kunnen verdere uitbreidingen worden beoordeeld, bijvoorbeeld BH11/BH31 op basis van BH16 en BH15 op basis van BH12. De eerstvolgende mijlpaal is een betrouwbaar werkende keten met geteste labels, juiste productroutes en duidelijke gebruikersrechten.</w:t>
       </w:r>
     </w:p>
     <w:p>

</xml_diff>

<commit_message>
docs: split management guidance into shorter paragraphs
</commit_message>
<xml_diff>
--- a/docs/management/Future-Factory-ontwikkeling-idee-naar-fabriekssysteem.docx
+++ b/docs/management/Future-Factory-ontwikkeling-idee-naar-fabriekssysteem.docx
@@ -1111,7 +1111,25 @@
     </w:p>
     <w:p>
       <w:r>
-        <w:t>Voor een goede invoering helpt het om structureel tijd beschikbaar te maken voor ontwikkeling, praktijktesten en begeleiding op de werkvloer. Er is tijd nodig om medewerkers te trainen en vooral om hen rustig mee te nemen in de nieuwe werkwijze. De feedback van mensen die al met Future Factory werken blijft daarbij belangrijk. De twee ploegen bij BH18 werken inmiddels zo vertrouwd met het systeem dat de papieren versie die er nog naast bestaat juist onrust kan veroorzaken. Het is daarom wenselijk dat planning weet dat orders niet meer op de oude manier met papiertjes tussen stappen worden geschoven. Medewerkers die nog aansluiten, moeten kunnen ervaren dat Future Factory breed door Future Pipe BV wordt gedragen en niet als iets persoonlijks of opgedrongens wordt ingevoerd. Het helpt ook om vooraf vast te leggen wie eigenaar is van het systeem, wie ondersteuning levert en wanneer een nieuwe productiestroom voldoende is getest om in gebruik te nemen. De ongeveer 90% ontwikkeling in vrije tijd verklaart de inzet tot nu toe, maar vormt geen vaste basis voor bedrijfsbreed beheer. De lage kosten die nu privé zijn betaald, zouden daarom geleidelijk naar Future Pipe BV kunnen worden overgebracht.</w:t>
+        <w:t>Voor een goede invoering helpt het om structureel tijd beschikbaar te maken voor ontwikkeling, praktijktesten en begeleiding op de werkvloer. Er is tijd nodig om medewerkers te trainen en vooral om hen rustig mee te nemen in de nieuwe werkwijze.</w:t>
+      </w:r>
+    </w:p>
+    <w:p>
+      <w:pPr/>
+      <w:r>
+        <w:t>De feedback van mensen die al met Future Factory werken blijft daarbij belangrijk. De twee ploegen bij BH18 werken inmiddels zo vertrouwd met het systeem dat de papieren versie die er nog naast bestaat juist onrust kan veroorzaken.</w:t>
+      </w:r>
+    </w:p>
+    <w:p>
+      <w:pPr/>
+      <w:r>
+        <w:t>Het is daarom wenselijk dat planning weet dat orders niet meer op de oude manier met papiertjes tussen stappen worden geschoven. Medewerkers die nog aansluiten, moeten kunnen ervaren dat Future Factory breed door Future Pipe BV wordt gedragen en niet als iets persoonlijks of opgedrongens wordt ingevoerd.</w:t>
+      </w:r>
+    </w:p>
+    <w:p>
+      <w:pPr/>
+      <w:r>
+        <w:t>Het helpt ook om vooraf vast te leggen wie eigenaar is van het systeem, wie ondersteuning levert en wanneer een nieuwe productiestroom voldoende is getest om in gebruik te nemen. De ongeveer 90% ontwikkeling in vrije tijd verklaart de inzet tot nu toe, maar vormt geen vaste basis voor bedrijfsbreed beheer. De lage kosten die nu privé zijn betaald, zouden daarom geleidelijk naar Future Pipe BV kunnen worden overgebracht.</w:t>
       </w:r>
     </w:p>
     <w:p>

</xml_diff>